<commit_message>
Updated Docs, installed pythonping and imported it
</commit_message>
<xml_diff>
--- a/documentation/2. Ping poller.docx
+++ b/documentation/2. Ping poller.docx
@@ -652,6 +652,433 @@
           <w:rFonts w:ascii="Consolas" w:hAnsi="Consolas"/>
         </w:rPr>
         <w:t>'</w:t>
+      </w:r>
+    </w:p>
+    <w:p>
+      <w:pPr>
+        <w:rPr>
+          <w:rFonts w:ascii="Consolas" w:hAnsi="Consolas"/>
+        </w:rPr>
+      </w:pPr>
+    </w:p>
+    <w:p>
+      <w:pPr>
+        <w:rPr>
+          <w:rFonts w:ascii="Consolas" w:hAnsi="Consolas"/>
+        </w:rPr>
+      </w:pPr>
+      <w:r>
+        <w:rPr>
+          <w:rFonts w:ascii="Consolas" w:hAnsi="Consolas"/>
+        </w:rPr>
+        <w:t xml:space="preserve">10.07: </w:t>
+      </w:r>
+    </w:p>
+    <w:p>
+      <w:pPr>
+        <w:rPr>
+          <w:rFonts w:ascii="Consolas" w:hAnsi="Consolas"/>
+        </w:rPr>
+      </w:pPr>
+      <w:r>
+        <w:rPr>
+          <w:rFonts w:ascii="Consolas" w:hAnsi="Consolas"/>
+        </w:rPr>
+        <w:tab/>
+        <w:t xml:space="preserve">- </w:t>
+      </w:r>
+      <w:proofErr w:type="spellStart"/>
+      <w:r>
+        <w:rPr>
+          <w:rFonts w:ascii="Consolas" w:hAnsi="Consolas"/>
+        </w:rPr>
+        <w:t>Issue</w:t>
+      </w:r>
+      <w:proofErr w:type="spellEnd"/>
+      <w:r>
+        <w:rPr>
+          <w:rFonts w:ascii="Consolas" w:hAnsi="Consolas"/>
+        </w:rPr>
+        <w:t xml:space="preserve"> </w:t>
+      </w:r>
+      <w:proofErr w:type="spellStart"/>
+      <w:r>
+        <w:rPr>
+          <w:rFonts w:ascii="Consolas" w:hAnsi="Consolas"/>
+        </w:rPr>
+        <w:t>seems</w:t>
+      </w:r>
+      <w:proofErr w:type="spellEnd"/>
+      <w:r>
+        <w:rPr>
+          <w:rFonts w:ascii="Consolas" w:hAnsi="Consolas"/>
+        </w:rPr>
+        <w:t xml:space="preserve"> </w:t>
+      </w:r>
+      <w:proofErr w:type="spellStart"/>
+      <w:r>
+        <w:rPr>
+          <w:rFonts w:ascii="Consolas" w:hAnsi="Consolas"/>
+        </w:rPr>
+        <w:t>to</w:t>
+      </w:r>
+      <w:proofErr w:type="spellEnd"/>
+      <w:r>
+        <w:rPr>
+          <w:rFonts w:ascii="Consolas" w:hAnsi="Consolas"/>
+        </w:rPr>
+        <w:t xml:space="preserve"> </w:t>
+      </w:r>
+      <w:proofErr w:type="spellStart"/>
+      <w:r>
+        <w:rPr>
+          <w:rFonts w:ascii="Consolas" w:hAnsi="Consolas"/>
+        </w:rPr>
+        <w:t>have</w:t>
+      </w:r>
+      <w:proofErr w:type="spellEnd"/>
+      <w:r>
+        <w:rPr>
+          <w:rFonts w:ascii="Consolas" w:hAnsi="Consolas"/>
+        </w:rPr>
+        <w:t xml:space="preserve"> </w:t>
+      </w:r>
+      <w:proofErr w:type="spellStart"/>
+      <w:r>
+        <w:rPr>
+          <w:rFonts w:ascii="Consolas" w:hAnsi="Consolas"/>
+        </w:rPr>
+        <w:t>been</w:t>
+      </w:r>
+      <w:proofErr w:type="spellEnd"/>
+      <w:r>
+        <w:rPr>
+          <w:rFonts w:ascii="Consolas" w:hAnsi="Consolas"/>
+        </w:rPr>
+        <w:t xml:space="preserve"> *</w:t>
+      </w:r>
+      <w:proofErr w:type="spellStart"/>
+      <w:r>
+        <w:rPr>
+          <w:rFonts w:ascii="Consolas" w:hAnsi="Consolas"/>
+        </w:rPr>
+        <w:t>where</w:t>
+      </w:r>
+      <w:proofErr w:type="spellEnd"/>
+      <w:r>
+        <w:rPr>
+          <w:rFonts w:ascii="Consolas" w:hAnsi="Consolas"/>
+        </w:rPr>
+        <w:t xml:space="preserve">* </w:t>
+      </w:r>
+      <w:proofErr w:type="spellStart"/>
+      <w:r>
+        <w:rPr>
+          <w:rFonts w:ascii="Consolas" w:hAnsi="Consolas"/>
+        </w:rPr>
+        <w:t>the</w:t>
+      </w:r>
+      <w:proofErr w:type="spellEnd"/>
+      <w:r>
+        <w:rPr>
+          <w:rFonts w:ascii="Consolas" w:hAnsi="Consolas"/>
+        </w:rPr>
+        <w:t xml:space="preserve"> </w:t>
+      </w:r>
+      <w:proofErr w:type="spellStart"/>
+      <w:r>
+        <w:rPr>
+          <w:rFonts w:ascii="Consolas" w:hAnsi="Consolas"/>
+        </w:rPr>
+        <w:t>terminal</w:t>
+      </w:r>
+      <w:proofErr w:type="spellEnd"/>
+      <w:r>
+        <w:rPr>
+          <w:rFonts w:ascii="Consolas" w:hAnsi="Consolas"/>
+        </w:rPr>
+        <w:t xml:space="preserve"> </w:t>
+      </w:r>
+      <w:proofErr w:type="spellStart"/>
+      <w:r>
+        <w:rPr>
+          <w:rFonts w:ascii="Consolas" w:hAnsi="Consolas"/>
+        </w:rPr>
+        <w:t>decided</w:t>
+      </w:r>
+      <w:proofErr w:type="spellEnd"/>
+      <w:r>
+        <w:rPr>
+          <w:rFonts w:ascii="Consolas" w:hAnsi="Consolas"/>
+        </w:rPr>
+        <w:t xml:space="preserve"> </w:t>
+      </w:r>
+      <w:proofErr w:type="spellStart"/>
+      <w:r>
+        <w:rPr>
+          <w:rFonts w:ascii="Consolas" w:hAnsi="Consolas"/>
+        </w:rPr>
+        <w:t>to</w:t>
+      </w:r>
+      <w:proofErr w:type="spellEnd"/>
+      <w:r>
+        <w:rPr>
+          <w:rFonts w:ascii="Consolas" w:hAnsi="Consolas"/>
+        </w:rPr>
+        <w:t xml:space="preserve"> </w:t>
+      </w:r>
+      <w:proofErr w:type="spellStart"/>
+      <w:r>
+        <w:rPr>
+          <w:rFonts w:ascii="Consolas" w:hAnsi="Consolas"/>
+        </w:rPr>
+        <w:t>install</w:t>
+      </w:r>
+      <w:proofErr w:type="spellEnd"/>
+      <w:r>
+        <w:rPr>
+          <w:rFonts w:ascii="Consolas" w:hAnsi="Consolas"/>
+        </w:rPr>
+        <w:t xml:space="preserve"> </w:t>
+      </w:r>
+      <w:proofErr w:type="spellStart"/>
+      <w:r>
+        <w:rPr>
+          <w:rFonts w:ascii="Consolas" w:hAnsi="Consolas"/>
+        </w:rPr>
+        <w:t>modules</w:t>
+      </w:r>
+      <w:proofErr w:type="spellEnd"/>
+      <w:r>
+        <w:rPr>
+          <w:rFonts w:ascii="Consolas" w:hAnsi="Consolas"/>
+        </w:rPr>
+        <w:t xml:space="preserve">. Fix : </w:t>
+      </w:r>
+    </w:p>
+    <w:p>
+      <w:pPr>
+        <w:rPr>
+          <w:rFonts w:ascii="Consolas" w:hAnsi="Consolas"/>
+        </w:rPr>
+      </w:pPr>
+      <w:hyperlink r:id="rId4" w:history="1">
+        <w:r>
+          <w:rPr>
+            <w:rStyle w:val="Hyperlink"/>
+            <w:rFonts w:ascii="Consolas" w:hAnsi="Consolas"/>
+          </w:rPr>
+          <w:t>https://stackoverflow.com/questions/59997065/pip-python-normal-site-packages-is-not-writeable</w:t>
+        </w:r>
+      </w:hyperlink>
+    </w:p>
+    <w:p>
+      <w:pPr>
+        <w:rPr>
+          <w:rFonts w:ascii="Consolas" w:hAnsi="Consolas"/>
+        </w:rPr>
+      </w:pPr>
+      <w:r>
+        <w:rPr>
+          <w:rFonts w:ascii="Consolas" w:hAnsi="Consolas"/>
+        </w:rPr>
+        <w:t xml:space="preserve">python3.13 -m </w:t>
+      </w:r>
+      <w:proofErr w:type="spellStart"/>
+      <w:r>
+        <w:rPr>
+          <w:rFonts w:ascii="Consolas" w:hAnsi="Consolas"/>
+        </w:rPr>
+        <w:t>pip</w:t>
+      </w:r>
+      <w:proofErr w:type="spellEnd"/>
+      <w:r>
+        <w:rPr>
+          <w:rFonts w:ascii="Consolas" w:hAnsi="Consolas"/>
+        </w:rPr>
+        <w:t xml:space="preserve"> </w:t>
+      </w:r>
+      <w:proofErr w:type="spellStart"/>
+      <w:r>
+        <w:rPr>
+          <w:rFonts w:ascii="Consolas" w:hAnsi="Consolas"/>
+        </w:rPr>
+        <w:t>install</w:t>
+      </w:r>
+      <w:proofErr w:type="spellEnd"/>
+      <w:r>
+        <w:rPr>
+          <w:rFonts w:ascii="Consolas" w:hAnsi="Consolas"/>
+        </w:rPr>
+        <w:t xml:space="preserve"> </w:t>
+      </w:r>
+      <w:proofErr w:type="spellStart"/>
+      <w:r>
+        <w:rPr>
+          <w:rFonts w:ascii="Consolas" w:hAnsi="Consolas"/>
+        </w:rPr>
+        <w:t>pythonping</w:t>
+      </w:r>
+      <w:proofErr w:type="spellEnd"/>
+    </w:p>
+    <w:p>
+      <w:pPr>
+        <w:rPr>
+          <w:rFonts w:ascii="Consolas" w:hAnsi="Consolas"/>
+        </w:rPr>
+      </w:pPr>
+      <w:proofErr w:type="spellStart"/>
+      <w:r>
+        <w:rPr>
+          <w:rFonts w:ascii="Consolas" w:hAnsi="Consolas"/>
+        </w:rPr>
+        <w:t>python</w:t>
+      </w:r>
+      <w:proofErr w:type="spellEnd"/>
+      <w:r>
+        <w:rPr>
+          <w:rFonts w:ascii="Consolas" w:hAnsi="Consolas"/>
+        </w:rPr>
+        <w:t>(</w:t>
+      </w:r>
+      <w:proofErr w:type="spellStart"/>
+      <w:r>
+        <w:rPr>
+          <w:rFonts w:ascii="Consolas" w:hAnsi="Consolas"/>
+        </w:rPr>
+        <w:t>ver</w:t>
+      </w:r>
+      <w:proofErr w:type="spellEnd"/>
+      <w:r>
+        <w:rPr>
+          <w:rFonts w:ascii="Consolas" w:hAnsi="Consolas"/>
+        </w:rPr>
+        <w:t xml:space="preserve">) -m </w:t>
+      </w:r>
+      <w:proofErr w:type="spellStart"/>
+      <w:r>
+        <w:rPr>
+          <w:rFonts w:ascii="Consolas" w:hAnsi="Consolas"/>
+        </w:rPr>
+        <w:t>pip</w:t>
+      </w:r>
+      <w:proofErr w:type="spellEnd"/>
+      <w:r>
+        <w:rPr>
+          <w:rFonts w:ascii="Consolas" w:hAnsi="Consolas"/>
+        </w:rPr>
+        <w:t xml:space="preserve"> </w:t>
+      </w:r>
+      <w:proofErr w:type="spellStart"/>
+      <w:r>
+        <w:rPr>
+          <w:rFonts w:ascii="Consolas" w:hAnsi="Consolas"/>
+        </w:rPr>
+        <w:t>install</w:t>
+      </w:r>
+      <w:proofErr w:type="spellEnd"/>
+      <w:r>
+        <w:rPr>
+          <w:rFonts w:ascii="Consolas" w:hAnsi="Consolas"/>
+        </w:rPr>
+        <w:t xml:space="preserve"> (</w:t>
+      </w:r>
+      <w:proofErr w:type="spellStart"/>
+      <w:r>
+        <w:rPr>
+          <w:rFonts w:ascii="Consolas" w:hAnsi="Consolas"/>
+        </w:rPr>
+        <w:t>module</w:t>
+      </w:r>
+      <w:proofErr w:type="spellEnd"/>
+      <w:r>
+        <w:rPr>
+          <w:rFonts w:ascii="Consolas" w:hAnsi="Consolas"/>
+        </w:rPr>
+        <w:t xml:space="preserve">) </w:t>
+      </w:r>
+    </w:p>
+    <w:p>
+      <w:pPr>
+        <w:rPr>
+          <w:rFonts w:ascii="Consolas" w:hAnsi="Consolas"/>
+        </w:rPr>
+      </w:pPr>
+      <w:r>
+        <w:rPr>
+          <w:rFonts w:ascii="Consolas" w:hAnsi="Consolas"/>
+        </w:rPr>
+        <w:t xml:space="preserve">python3.13 -m </w:t>
+      </w:r>
+      <w:proofErr w:type="spellStart"/>
+      <w:r>
+        <w:rPr>
+          <w:rFonts w:ascii="Consolas" w:hAnsi="Consolas"/>
+        </w:rPr>
+        <w:t>makes</w:t>
+      </w:r>
+      <w:proofErr w:type="spellEnd"/>
+      <w:r>
+        <w:rPr>
+          <w:rFonts w:ascii="Consolas" w:hAnsi="Consolas"/>
+        </w:rPr>
+        <w:t xml:space="preserve"> </w:t>
+      </w:r>
+      <w:proofErr w:type="spellStart"/>
+      <w:r>
+        <w:rPr>
+          <w:rFonts w:ascii="Consolas" w:hAnsi="Consolas"/>
+        </w:rPr>
+        <w:t>pip</w:t>
+      </w:r>
+      <w:proofErr w:type="spellEnd"/>
+      <w:r>
+        <w:rPr>
+          <w:rFonts w:ascii="Consolas" w:hAnsi="Consolas"/>
+        </w:rPr>
+        <w:t xml:space="preserve"> </w:t>
+      </w:r>
+      <w:proofErr w:type="spellStart"/>
+      <w:r>
+        <w:rPr>
+          <w:rFonts w:ascii="Consolas" w:hAnsi="Consolas"/>
+        </w:rPr>
+        <w:t>run</w:t>
+      </w:r>
+      <w:proofErr w:type="spellEnd"/>
+      <w:r>
+        <w:rPr>
+          <w:rFonts w:ascii="Consolas" w:hAnsi="Consolas"/>
+        </w:rPr>
+        <w:t xml:space="preserve"> </w:t>
+      </w:r>
+      <w:proofErr w:type="spellStart"/>
+      <w:r>
+        <w:rPr>
+          <w:rFonts w:ascii="Consolas" w:hAnsi="Consolas"/>
+        </w:rPr>
+        <w:t>as</w:t>
+      </w:r>
+      <w:proofErr w:type="spellEnd"/>
+      <w:r>
+        <w:rPr>
+          <w:rFonts w:ascii="Consolas" w:hAnsi="Consolas"/>
+        </w:rPr>
+        <w:t xml:space="preserve"> a </w:t>
+      </w:r>
+      <w:proofErr w:type="spellStart"/>
+      <w:r>
+        <w:rPr>
+          <w:rFonts w:ascii="Consolas" w:hAnsi="Consolas"/>
+        </w:rPr>
+        <w:t>script</w:t>
+      </w:r>
+      <w:proofErr w:type="spellEnd"/>
+      <w:r>
+        <w:rPr>
+          <w:rFonts w:ascii="Consolas" w:hAnsi="Consolas"/>
+        </w:rPr>
+        <w:t xml:space="preserve"> </w:t>
       </w:r>
     </w:p>
     <w:sectPr>
@@ -1124,6 +1551,29 @@
       <w:szCs w:val="32"/>
     </w:rPr>
   </w:style>
+  <w:style w:type="character" w:styleId="Hyperlink">
+    <w:name w:val="Hyperlink"/>
+    <w:basedOn w:val="Absatz-Standardschriftart"/>
+    <w:uiPriority w:val="99"/>
+    <w:unhideWhenUsed/>
+    <w:rsid w:val="008C5D03"/>
+    <w:rPr>
+      <w:color w:val="0563C1" w:themeColor="hyperlink"/>
+      <w:u w:val="single"/>
+    </w:rPr>
+  </w:style>
+  <w:style w:type="character" w:styleId="NichtaufgelsteErwhnung">
+    <w:name w:val="Unresolved Mention"/>
+    <w:basedOn w:val="Absatz-Standardschriftart"/>
+    <w:uiPriority w:val="99"/>
+    <w:semiHidden/>
+    <w:unhideWhenUsed/>
+    <w:rsid w:val="008C5D03"/>
+    <w:rPr>
+      <w:color w:val="605E5C"/>
+      <w:shd w:val="clear" w:color="auto" w:fill="E1DFDD"/>
+    </w:rPr>
+  </w:style>
 </w:styles>
 </file>
 

</xml_diff>

<commit_message>
Worked on Poller.py and further researched csv in python
</commit_message>
<xml_diff>
--- a/documentation/2. Ping poller.docx
+++ b/documentation/2. Ping poller.docx
@@ -13,63 +13,7 @@
         <w:rPr>
           <w:rFonts w:ascii="Consolas" w:hAnsi="Consolas"/>
         </w:rPr>
-        <w:t xml:space="preserve">2. Ping Poller – Poller.py </w:t>
-      </w:r>
-      <w:proofErr w:type="spellStart"/>
-      <w:r>
-        <w:rPr>
-          <w:rFonts w:ascii="Consolas" w:hAnsi="Consolas"/>
-        </w:rPr>
-        <w:t>that</w:t>
-      </w:r>
-      <w:proofErr w:type="spellEnd"/>
-      <w:r>
-        <w:rPr>
-          <w:rFonts w:ascii="Consolas" w:hAnsi="Consolas"/>
-        </w:rPr>
-        <w:t xml:space="preserve"> </w:t>
-      </w:r>
-      <w:proofErr w:type="spellStart"/>
-      <w:r>
-        <w:rPr>
-          <w:rFonts w:ascii="Consolas" w:hAnsi="Consolas"/>
-        </w:rPr>
-        <w:t>reads</w:t>
-      </w:r>
-      <w:proofErr w:type="spellEnd"/>
-      <w:r>
-        <w:rPr>
-          <w:rFonts w:ascii="Consolas" w:hAnsi="Consolas"/>
-        </w:rPr>
-        <w:t xml:space="preserve"> devices.csv and </w:t>
-      </w:r>
-      <w:proofErr w:type="spellStart"/>
-      <w:r>
-        <w:rPr>
-          <w:rFonts w:ascii="Consolas" w:hAnsi="Consolas"/>
-        </w:rPr>
-        <w:t>pings</w:t>
-      </w:r>
-      <w:proofErr w:type="spellEnd"/>
-      <w:r>
-        <w:rPr>
-          <w:rFonts w:ascii="Consolas" w:hAnsi="Consolas"/>
-        </w:rPr>
-        <w:t xml:space="preserve"> </w:t>
-      </w:r>
-      <w:proofErr w:type="spellStart"/>
-      <w:r>
-        <w:rPr>
-          <w:rFonts w:ascii="Consolas" w:hAnsi="Consolas"/>
-        </w:rPr>
-        <w:t>each</w:t>
-      </w:r>
-      <w:proofErr w:type="spellEnd"/>
-      <w:r>
-        <w:rPr>
-          <w:rFonts w:ascii="Consolas" w:hAnsi="Consolas"/>
-        </w:rPr>
-        <w:t>.</w:t>
+        <w:t>2. Ping Poller – Poller.py that reads devices.csv and pings each.</w:t>
       </w:r>
     </w:p>
     <w:p>
@@ -111,61 +55,11 @@
         </w:rPr>
         <w:t xml:space="preserve">- </w:t>
       </w:r>
-      <w:proofErr w:type="spellStart"/>
-      <w:r>
-        <w:rPr>
-          <w:rFonts w:ascii="Consolas" w:hAnsi="Consolas"/>
-        </w:rPr>
-        <w:t>Got</w:t>
-      </w:r>
-      <w:proofErr w:type="spellEnd"/>
-      <w:r>
-        <w:rPr>
-          <w:rFonts w:ascii="Consolas" w:hAnsi="Consolas"/>
-        </w:rPr>
-        <w:t xml:space="preserve"> devices.py </w:t>
-      </w:r>
-      <w:proofErr w:type="spellStart"/>
-      <w:r>
-        <w:rPr>
-          <w:rFonts w:ascii="Consolas" w:hAnsi="Consolas"/>
-        </w:rPr>
-        <w:t>to</w:t>
-      </w:r>
-      <w:proofErr w:type="spellEnd"/>
-      <w:r>
-        <w:rPr>
-          <w:rFonts w:ascii="Consolas" w:hAnsi="Consolas"/>
-        </w:rPr>
-        <w:t xml:space="preserve"> </w:t>
-      </w:r>
-      <w:proofErr w:type="spellStart"/>
-      <w:r>
-        <w:rPr>
-          <w:rFonts w:ascii="Consolas" w:hAnsi="Consolas"/>
-        </w:rPr>
-        <w:t>be</w:t>
-      </w:r>
-      <w:proofErr w:type="spellEnd"/>
-      <w:r>
-        <w:rPr>
-          <w:rFonts w:ascii="Consolas" w:hAnsi="Consolas"/>
-        </w:rPr>
-        <w:t xml:space="preserve"> </w:t>
-      </w:r>
-      <w:proofErr w:type="spellStart"/>
-      <w:r>
-        <w:rPr>
-          <w:rFonts w:ascii="Consolas" w:hAnsi="Consolas"/>
-        </w:rPr>
-        <w:t>read</w:t>
-      </w:r>
-      <w:proofErr w:type="spellEnd"/>
-      <w:r>
-        <w:rPr>
-          <w:rFonts w:ascii="Consolas" w:hAnsi="Consolas"/>
-        </w:rPr>
-        <w:t xml:space="preserve"> and printed.</w:t>
+      <w:r>
+        <w:rPr>
+          <w:rFonts w:ascii="Consolas" w:hAnsi="Consolas"/>
+        </w:rPr>
+        <w:t>Got devices.py to be read and printed.</w:t>
       </w:r>
     </w:p>
     <w:p>
@@ -179,100 +73,8 @@
         <w:rPr>
           <w:rFonts w:ascii="Consolas" w:hAnsi="Consolas"/>
         </w:rPr>
-        <w:t xml:space="preserve">- </w:t>
-      </w:r>
-      <w:proofErr w:type="spellStart"/>
-      <w:r>
-        <w:rPr>
-          <w:rFonts w:ascii="Consolas" w:hAnsi="Consolas"/>
-        </w:rPr>
-        <w:t>Found</w:t>
-      </w:r>
-      <w:proofErr w:type="spellEnd"/>
-      <w:r>
-        <w:rPr>
-          <w:rFonts w:ascii="Consolas" w:hAnsi="Consolas"/>
-        </w:rPr>
-        <w:t xml:space="preserve"> </w:t>
-      </w:r>
-      <w:proofErr w:type="spellStart"/>
-      <w:r>
-        <w:rPr>
-          <w:rFonts w:ascii="Consolas" w:hAnsi="Consolas"/>
-        </w:rPr>
-        <w:t>Pythonping</w:t>
-      </w:r>
-      <w:proofErr w:type="spellEnd"/>
-      <w:r>
-        <w:rPr>
-          <w:rFonts w:ascii="Consolas" w:hAnsi="Consolas"/>
-        </w:rPr>
-        <w:t xml:space="preserve"> </w:t>
-      </w:r>
-      <w:proofErr w:type="spellStart"/>
-      <w:r>
-        <w:rPr>
-          <w:rFonts w:ascii="Consolas" w:hAnsi="Consolas"/>
-        </w:rPr>
-        <w:t>as</w:t>
-      </w:r>
-      <w:proofErr w:type="spellEnd"/>
-      <w:r>
-        <w:rPr>
-          <w:rFonts w:ascii="Consolas" w:hAnsi="Consolas"/>
-        </w:rPr>
-        <w:t xml:space="preserve"> </w:t>
-      </w:r>
-      <w:proofErr w:type="spellStart"/>
-      <w:r>
-        <w:rPr>
-          <w:rFonts w:ascii="Consolas" w:hAnsi="Consolas"/>
-        </w:rPr>
-        <w:t>solution</w:t>
-      </w:r>
-      <w:proofErr w:type="spellEnd"/>
-      <w:r>
-        <w:rPr>
-          <w:rFonts w:ascii="Consolas" w:hAnsi="Consolas"/>
-        </w:rPr>
-        <w:t xml:space="preserve"> </w:t>
-      </w:r>
-      <w:proofErr w:type="spellStart"/>
-      <w:r>
-        <w:rPr>
-          <w:rFonts w:ascii="Consolas" w:hAnsi="Consolas"/>
-        </w:rPr>
-        <w:t>for</w:t>
-      </w:r>
-      <w:proofErr w:type="spellEnd"/>
-      <w:r>
-        <w:rPr>
-          <w:rFonts w:ascii="Consolas" w:hAnsi="Consolas"/>
-        </w:rPr>
-        <w:t xml:space="preserve"> </w:t>
-      </w:r>
-      <w:proofErr w:type="spellStart"/>
-      <w:r>
-        <w:rPr>
-          <w:rFonts w:ascii="Consolas" w:hAnsi="Consolas"/>
-        </w:rPr>
-        <w:t>pinging</w:t>
-      </w:r>
-      <w:proofErr w:type="spellEnd"/>
-      <w:r>
-        <w:rPr>
-          <w:rFonts w:ascii="Consolas" w:hAnsi="Consolas"/>
-        </w:rPr>
-        <w:t xml:space="preserve"> in </w:t>
-      </w:r>
-      <w:proofErr w:type="spellStart"/>
-      <w:r>
-        <w:rPr>
-          <w:rFonts w:ascii="Consolas" w:hAnsi="Consolas"/>
-        </w:rPr>
-        <w:t>python</w:t>
-      </w:r>
-      <w:proofErr w:type="spellEnd"/>
+        <w:t>- Found Pythonping as solution for pinging in python</w:t>
+      </w:r>
     </w:p>
     <w:p>
       <w:pPr>
@@ -285,133 +87,7 @@
         <w:rPr>
           <w:rFonts w:ascii="Consolas" w:hAnsi="Consolas"/>
         </w:rPr>
-        <w:t xml:space="preserve">- </w:t>
-      </w:r>
-      <w:proofErr w:type="spellStart"/>
-      <w:r>
-        <w:rPr>
-          <w:rFonts w:ascii="Consolas" w:hAnsi="Consolas"/>
-        </w:rPr>
-        <w:t>Tried</w:t>
-      </w:r>
-      <w:proofErr w:type="spellEnd"/>
-      <w:r>
-        <w:rPr>
-          <w:rFonts w:ascii="Consolas" w:hAnsi="Consolas"/>
-        </w:rPr>
-        <w:t xml:space="preserve"> </w:t>
-      </w:r>
-      <w:proofErr w:type="spellStart"/>
-      <w:r>
-        <w:rPr>
-          <w:rFonts w:ascii="Consolas" w:hAnsi="Consolas"/>
-        </w:rPr>
-        <w:t>to</w:t>
-      </w:r>
-      <w:proofErr w:type="spellEnd"/>
-      <w:r>
-        <w:rPr>
-          <w:rFonts w:ascii="Consolas" w:hAnsi="Consolas"/>
-        </w:rPr>
-        <w:t xml:space="preserve"> </w:t>
-      </w:r>
-      <w:proofErr w:type="spellStart"/>
-      <w:r>
-        <w:rPr>
-          <w:rFonts w:ascii="Consolas" w:hAnsi="Consolas"/>
-        </w:rPr>
-        <w:t>install</w:t>
-      </w:r>
-      <w:proofErr w:type="spellEnd"/>
-      <w:r>
-        <w:rPr>
-          <w:rFonts w:ascii="Consolas" w:hAnsi="Consolas"/>
-        </w:rPr>
-        <w:t xml:space="preserve">, </w:t>
-      </w:r>
-      <w:proofErr w:type="spellStart"/>
-      <w:r>
-        <w:rPr>
-          <w:rFonts w:ascii="Consolas" w:hAnsi="Consolas"/>
-        </w:rPr>
-        <w:t>for</w:t>
-      </w:r>
-      <w:proofErr w:type="spellEnd"/>
-      <w:r>
-        <w:rPr>
-          <w:rFonts w:ascii="Consolas" w:hAnsi="Consolas"/>
-        </w:rPr>
-        <w:t xml:space="preserve"> </w:t>
-      </w:r>
-      <w:proofErr w:type="spellStart"/>
-      <w:r>
-        <w:rPr>
-          <w:rFonts w:ascii="Consolas" w:hAnsi="Consolas"/>
-        </w:rPr>
-        <w:t>some</w:t>
-      </w:r>
-      <w:proofErr w:type="spellEnd"/>
-      <w:r>
-        <w:rPr>
-          <w:rFonts w:ascii="Consolas" w:hAnsi="Consolas"/>
-        </w:rPr>
-        <w:t xml:space="preserve"> </w:t>
-      </w:r>
-      <w:proofErr w:type="spellStart"/>
-      <w:r>
-        <w:rPr>
-          <w:rFonts w:ascii="Consolas" w:hAnsi="Consolas"/>
-        </w:rPr>
-        <w:t>reason</w:t>
-      </w:r>
-      <w:proofErr w:type="spellEnd"/>
-      <w:r>
-        <w:rPr>
-          <w:rFonts w:ascii="Consolas" w:hAnsi="Consolas"/>
-        </w:rPr>
-        <w:t xml:space="preserve"> ist not </w:t>
-      </w:r>
-      <w:proofErr w:type="spellStart"/>
-      <w:r>
-        <w:rPr>
-          <w:rFonts w:ascii="Consolas" w:hAnsi="Consolas"/>
-        </w:rPr>
-        <w:t>seen</w:t>
-      </w:r>
-      <w:proofErr w:type="spellEnd"/>
-      <w:r>
-        <w:rPr>
-          <w:rFonts w:ascii="Consolas" w:hAnsi="Consolas"/>
-        </w:rPr>
-        <w:t xml:space="preserve"> </w:t>
-      </w:r>
-      <w:proofErr w:type="spellStart"/>
-      <w:r>
-        <w:rPr>
-          <w:rFonts w:ascii="Consolas" w:hAnsi="Consolas"/>
-        </w:rPr>
-        <w:t>by</w:t>
-      </w:r>
-      <w:proofErr w:type="spellEnd"/>
-      <w:r>
-        <w:rPr>
-          <w:rFonts w:ascii="Consolas" w:hAnsi="Consolas"/>
-        </w:rPr>
-        <w:t xml:space="preserve"> </w:t>
-      </w:r>
-      <w:proofErr w:type="spellStart"/>
-      <w:r>
-        <w:rPr>
-          <w:rFonts w:ascii="Consolas" w:hAnsi="Consolas"/>
-        </w:rPr>
-        <w:t>vscode</w:t>
-      </w:r>
-      <w:proofErr w:type="spellEnd"/>
-      <w:r>
-        <w:rPr>
-          <w:rFonts w:ascii="Consolas" w:hAnsi="Consolas"/>
-        </w:rPr>
-        <w:t>:</w:t>
+        <w:t>- Tried to install, for some reason ist not seen by vscode:</w:t>
       </w:r>
     </w:p>
     <w:p>
@@ -421,61 +97,11 @@
           <w:rFonts w:ascii="Consolas" w:hAnsi="Consolas"/>
         </w:rPr>
       </w:pPr>
-      <w:proofErr w:type="spellStart"/>
-      <w:r>
-        <w:rPr>
-          <w:rFonts w:ascii="Consolas" w:hAnsi="Consolas"/>
-        </w:rPr>
-        <w:t>Traceback</w:t>
-      </w:r>
-      <w:proofErr w:type="spellEnd"/>
-      <w:r>
-        <w:rPr>
-          <w:rFonts w:ascii="Consolas" w:hAnsi="Consolas"/>
-        </w:rPr>
-        <w:t xml:space="preserve"> (</w:t>
-      </w:r>
-      <w:proofErr w:type="spellStart"/>
-      <w:r>
-        <w:rPr>
-          <w:rFonts w:ascii="Consolas" w:hAnsi="Consolas"/>
-        </w:rPr>
-        <w:t>most</w:t>
-      </w:r>
-      <w:proofErr w:type="spellEnd"/>
-      <w:r>
-        <w:rPr>
-          <w:rFonts w:ascii="Consolas" w:hAnsi="Consolas"/>
-        </w:rPr>
-        <w:t xml:space="preserve"> </w:t>
-      </w:r>
-      <w:proofErr w:type="spellStart"/>
-      <w:r>
-        <w:rPr>
-          <w:rFonts w:ascii="Consolas" w:hAnsi="Consolas"/>
-        </w:rPr>
-        <w:t>recent</w:t>
-      </w:r>
-      <w:proofErr w:type="spellEnd"/>
-      <w:r>
-        <w:rPr>
-          <w:rFonts w:ascii="Consolas" w:hAnsi="Consolas"/>
-        </w:rPr>
-        <w:t xml:space="preserve"> </w:t>
-      </w:r>
-      <w:proofErr w:type="spellStart"/>
-      <w:r>
-        <w:rPr>
-          <w:rFonts w:ascii="Consolas" w:hAnsi="Consolas"/>
-        </w:rPr>
-        <w:t>call</w:t>
-      </w:r>
-      <w:proofErr w:type="spellEnd"/>
-      <w:r>
-        <w:rPr>
-          <w:rFonts w:ascii="Consolas" w:hAnsi="Consolas"/>
-        </w:rPr>
-        <w:t xml:space="preserve"> last):</w:t>
+      <w:r>
+        <w:rPr>
+          <w:rFonts w:ascii="Consolas" w:hAnsi="Consolas"/>
+        </w:rPr>
+        <w:t>Traceback (most recent call last):</w:t>
       </w:r>
     </w:p>
     <w:p>
@@ -489,35 +115,7 @@
         <w:rPr>
           <w:rFonts w:ascii="Consolas" w:hAnsi="Consolas"/>
         </w:rPr>
-        <w:t xml:space="preserve">  File "c:\Projects\Network_Health\nethealth\nethealth.py", </w:t>
-      </w:r>
-      <w:proofErr w:type="spellStart"/>
-      <w:r>
-        <w:rPr>
-          <w:rFonts w:ascii="Consolas" w:hAnsi="Consolas"/>
-        </w:rPr>
-        <w:t>line</w:t>
-      </w:r>
-      <w:proofErr w:type="spellEnd"/>
-      <w:r>
-        <w:rPr>
-          <w:rFonts w:ascii="Consolas" w:hAnsi="Consolas"/>
-        </w:rPr>
-        <w:t xml:space="preserve"> 2, in &lt;</w:t>
-      </w:r>
-      <w:proofErr w:type="spellStart"/>
-      <w:r>
-        <w:rPr>
-          <w:rFonts w:ascii="Consolas" w:hAnsi="Consolas"/>
-        </w:rPr>
-        <w:t>module</w:t>
-      </w:r>
-      <w:proofErr w:type="spellEnd"/>
-      <w:r>
-        <w:rPr>
-          <w:rFonts w:ascii="Consolas" w:hAnsi="Consolas"/>
-        </w:rPr>
-        <w:t>&gt;</w:t>
+        <w:t xml:space="preserve">  File "c:\Projects\Network_Health\nethealth\nethealth.py", line 2, in &lt;module&gt;</w:t>
       </w:r>
     </w:p>
     <w:p>
@@ -531,49 +129,7 @@
         <w:rPr>
           <w:rFonts w:ascii="Consolas" w:hAnsi="Consolas"/>
         </w:rPr>
-        <w:t xml:space="preserve">    </w:t>
-      </w:r>
-      <w:proofErr w:type="spellStart"/>
-      <w:r>
-        <w:rPr>
-          <w:rFonts w:ascii="Consolas" w:hAnsi="Consolas"/>
-        </w:rPr>
-        <w:t>from</w:t>
-      </w:r>
-      <w:proofErr w:type="spellEnd"/>
-      <w:r>
-        <w:rPr>
-          <w:rFonts w:ascii="Consolas" w:hAnsi="Consolas"/>
-        </w:rPr>
-        <w:t xml:space="preserve"> </w:t>
-      </w:r>
-      <w:proofErr w:type="spellStart"/>
-      <w:r>
-        <w:rPr>
-          <w:rFonts w:ascii="Consolas" w:hAnsi="Consolas"/>
-        </w:rPr>
-        <w:t>pythonping</w:t>
-      </w:r>
-      <w:proofErr w:type="spellEnd"/>
-      <w:r>
-        <w:rPr>
-          <w:rFonts w:ascii="Consolas" w:hAnsi="Consolas"/>
-        </w:rPr>
-        <w:t xml:space="preserve"> </w:t>
-      </w:r>
-      <w:proofErr w:type="spellStart"/>
-      <w:r>
-        <w:rPr>
-          <w:rFonts w:ascii="Consolas" w:hAnsi="Consolas"/>
-        </w:rPr>
-        <w:t>import</w:t>
-      </w:r>
-      <w:proofErr w:type="spellEnd"/>
-      <w:r>
-        <w:rPr>
-          <w:rFonts w:ascii="Consolas" w:hAnsi="Consolas"/>
-        </w:rPr>
-        <w:t xml:space="preserve"> ping</w:t>
+        <w:t xml:space="preserve">    from pythonping import ping</w:t>
       </w:r>
     </w:p>
     <w:p>
@@ -583,75 +139,11 @@
           <w:rFonts w:ascii="Consolas" w:hAnsi="Consolas"/>
         </w:rPr>
       </w:pPr>
-      <w:proofErr w:type="spellStart"/>
-      <w:r>
-        <w:rPr>
-          <w:rFonts w:ascii="Consolas" w:hAnsi="Consolas"/>
-        </w:rPr>
-        <w:t>ModuleNotFoundError</w:t>
-      </w:r>
-      <w:proofErr w:type="spellEnd"/>
-      <w:r>
-        <w:rPr>
-          <w:rFonts w:ascii="Consolas" w:hAnsi="Consolas"/>
-        </w:rPr>
-        <w:t xml:space="preserve">: </w:t>
-      </w:r>
-      <w:proofErr w:type="spellStart"/>
-      <w:r>
-        <w:rPr>
-          <w:rFonts w:ascii="Consolas" w:hAnsi="Consolas"/>
-        </w:rPr>
-        <w:t>No</w:t>
-      </w:r>
-      <w:proofErr w:type="spellEnd"/>
-      <w:r>
-        <w:rPr>
-          <w:rFonts w:ascii="Consolas" w:hAnsi="Consolas"/>
-        </w:rPr>
-        <w:t xml:space="preserve"> </w:t>
-      </w:r>
-      <w:proofErr w:type="spellStart"/>
-      <w:r>
-        <w:rPr>
-          <w:rFonts w:ascii="Consolas" w:hAnsi="Consolas"/>
-        </w:rPr>
-        <w:t>module</w:t>
-      </w:r>
-      <w:proofErr w:type="spellEnd"/>
-      <w:r>
-        <w:rPr>
-          <w:rFonts w:ascii="Consolas" w:hAnsi="Consolas"/>
-        </w:rPr>
-        <w:t xml:space="preserve"> </w:t>
-      </w:r>
-      <w:proofErr w:type="spellStart"/>
-      <w:r>
-        <w:rPr>
-          <w:rFonts w:ascii="Consolas" w:hAnsi="Consolas"/>
-        </w:rPr>
-        <w:t>named</w:t>
-      </w:r>
-      <w:proofErr w:type="spellEnd"/>
-      <w:r>
-        <w:rPr>
-          <w:rFonts w:ascii="Consolas" w:hAnsi="Consolas"/>
-        </w:rPr>
-        <w:t xml:space="preserve"> '</w:t>
-      </w:r>
-      <w:proofErr w:type="spellStart"/>
-      <w:r>
-        <w:rPr>
-          <w:rFonts w:ascii="Consolas" w:hAnsi="Consolas"/>
-        </w:rPr>
-        <w:t>pythonping</w:t>
-      </w:r>
-      <w:proofErr w:type="spellEnd"/>
-      <w:r>
-        <w:rPr>
-          <w:rFonts w:ascii="Consolas" w:hAnsi="Consolas"/>
-        </w:rPr>
-        <w:t>'</w:t>
+      <w:r>
+        <w:rPr>
+          <w:rFonts w:ascii="Consolas" w:hAnsi="Consolas"/>
+        </w:rPr>
+        <w:t>ModuleNotFoundError: No module named 'pythonping'</w:t>
       </w:r>
     </w:p>
     <w:p>
@@ -685,189 +177,7 @@
           <w:rFonts w:ascii="Consolas" w:hAnsi="Consolas"/>
         </w:rPr>
         <w:tab/>
-        <w:t xml:space="preserve">- </w:t>
-      </w:r>
-      <w:proofErr w:type="spellStart"/>
-      <w:r>
-        <w:rPr>
-          <w:rFonts w:ascii="Consolas" w:hAnsi="Consolas"/>
-        </w:rPr>
-        <w:t>Issue</w:t>
-      </w:r>
-      <w:proofErr w:type="spellEnd"/>
-      <w:r>
-        <w:rPr>
-          <w:rFonts w:ascii="Consolas" w:hAnsi="Consolas"/>
-        </w:rPr>
-        <w:t xml:space="preserve"> </w:t>
-      </w:r>
-      <w:proofErr w:type="spellStart"/>
-      <w:r>
-        <w:rPr>
-          <w:rFonts w:ascii="Consolas" w:hAnsi="Consolas"/>
-        </w:rPr>
-        <w:t>seems</w:t>
-      </w:r>
-      <w:proofErr w:type="spellEnd"/>
-      <w:r>
-        <w:rPr>
-          <w:rFonts w:ascii="Consolas" w:hAnsi="Consolas"/>
-        </w:rPr>
-        <w:t xml:space="preserve"> </w:t>
-      </w:r>
-      <w:proofErr w:type="spellStart"/>
-      <w:r>
-        <w:rPr>
-          <w:rFonts w:ascii="Consolas" w:hAnsi="Consolas"/>
-        </w:rPr>
-        <w:t>to</w:t>
-      </w:r>
-      <w:proofErr w:type="spellEnd"/>
-      <w:r>
-        <w:rPr>
-          <w:rFonts w:ascii="Consolas" w:hAnsi="Consolas"/>
-        </w:rPr>
-        <w:t xml:space="preserve"> </w:t>
-      </w:r>
-      <w:proofErr w:type="spellStart"/>
-      <w:r>
-        <w:rPr>
-          <w:rFonts w:ascii="Consolas" w:hAnsi="Consolas"/>
-        </w:rPr>
-        <w:t>have</w:t>
-      </w:r>
-      <w:proofErr w:type="spellEnd"/>
-      <w:r>
-        <w:rPr>
-          <w:rFonts w:ascii="Consolas" w:hAnsi="Consolas"/>
-        </w:rPr>
-        <w:t xml:space="preserve"> </w:t>
-      </w:r>
-      <w:proofErr w:type="spellStart"/>
-      <w:r>
-        <w:rPr>
-          <w:rFonts w:ascii="Consolas" w:hAnsi="Consolas"/>
-        </w:rPr>
-        <w:t>been</w:t>
-      </w:r>
-      <w:proofErr w:type="spellEnd"/>
-      <w:r>
-        <w:rPr>
-          <w:rFonts w:ascii="Consolas" w:hAnsi="Consolas"/>
-        </w:rPr>
-        <w:t xml:space="preserve"> *</w:t>
-      </w:r>
-      <w:proofErr w:type="spellStart"/>
-      <w:r>
-        <w:rPr>
-          <w:rFonts w:ascii="Consolas" w:hAnsi="Consolas"/>
-        </w:rPr>
-        <w:t>where</w:t>
-      </w:r>
-      <w:proofErr w:type="spellEnd"/>
-      <w:r>
-        <w:rPr>
-          <w:rFonts w:ascii="Consolas" w:hAnsi="Consolas"/>
-        </w:rPr>
-        <w:t xml:space="preserve">* </w:t>
-      </w:r>
-      <w:proofErr w:type="spellStart"/>
-      <w:r>
-        <w:rPr>
-          <w:rFonts w:ascii="Consolas" w:hAnsi="Consolas"/>
-        </w:rPr>
-        <w:t>the</w:t>
-      </w:r>
-      <w:proofErr w:type="spellEnd"/>
-      <w:r>
-        <w:rPr>
-          <w:rFonts w:ascii="Consolas" w:hAnsi="Consolas"/>
-        </w:rPr>
-        <w:t xml:space="preserve"> </w:t>
-      </w:r>
-      <w:proofErr w:type="spellStart"/>
-      <w:r>
-        <w:rPr>
-          <w:rFonts w:ascii="Consolas" w:hAnsi="Consolas"/>
-        </w:rPr>
-        <w:t>terminal</w:t>
-      </w:r>
-      <w:proofErr w:type="spellEnd"/>
-      <w:r>
-        <w:rPr>
-          <w:rFonts w:ascii="Consolas" w:hAnsi="Consolas"/>
-        </w:rPr>
-        <w:t xml:space="preserve"> </w:t>
-      </w:r>
-      <w:proofErr w:type="spellStart"/>
-      <w:r>
-        <w:rPr>
-          <w:rFonts w:ascii="Consolas" w:hAnsi="Consolas"/>
-        </w:rPr>
-        <w:t>decided</w:t>
-      </w:r>
-      <w:proofErr w:type="spellEnd"/>
-      <w:r>
-        <w:rPr>
-          <w:rFonts w:ascii="Consolas" w:hAnsi="Consolas"/>
-        </w:rPr>
-        <w:t xml:space="preserve"> </w:t>
-      </w:r>
-      <w:proofErr w:type="spellStart"/>
-      <w:r>
-        <w:rPr>
-          <w:rFonts w:ascii="Consolas" w:hAnsi="Consolas"/>
-        </w:rPr>
-        <w:t>to</w:t>
-      </w:r>
-      <w:proofErr w:type="spellEnd"/>
-      <w:r>
-        <w:rPr>
-          <w:rFonts w:ascii="Consolas" w:hAnsi="Consolas"/>
-        </w:rPr>
-        <w:t xml:space="preserve"> </w:t>
-      </w:r>
-      <w:proofErr w:type="spellStart"/>
-      <w:r>
-        <w:rPr>
-          <w:rFonts w:ascii="Consolas" w:hAnsi="Consolas"/>
-        </w:rPr>
-        <w:t>install</w:t>
-      </w:r>
-      <w:proofErr w:type="spellEnd"/>
-      <w:r>
-        <w:rPr>
-          <w:rFonts w:ascii="Consolas" w:hAnsi="Consolas"/>
-        </w:rPr>
-        <w:t xml:space="preserve"> </w:t>
-      </w:r>
-      <w:proofErr w:type="spellStart"/>
-      <w:r>
-        <w:rPr>
-          <w:rFonts w:ascii="Consolas" w:hAnsi="Consolas"/>
-        </w:rPr>
-        <w:t>modules</w:t>
-      </w:r>
-      <w:proofErr w:type="spellEnd"/>
-      <w:r>
-        <w:rPr>
-          <w:rFonts w:ascii="Consolas" w:hAnsi="Consolas"/>
-        </w:rPr>
-        <w:t xml:space="preserve">. </w:t>
-      </w:r>
-      <w:proofErr w:type="gramStart"/>
-      <w:r>
-        <w:rPr>
-          <w:rFonts w:ascii="Consolas" w:hAnsi="Consolas"/>
-        </w:rPr>
-        <w:t>Fix :</w:t>
-      </w:r>
-      <w:proofErr w:type="gramEnd"/>
-      <w:r>
-        <w:rPr>
-          <w:rFonts w:ascii="Consolas" w:hAnsi="Consolas"/>
-        </w:rPr>
-        <w:t xml:space="preserve"> </w:t>
+        <w:t xml:space="preserve">- Issue seems to have been *where* the terminal decided to install modules. Fix : </w:t>
       </w:r>
     </w:p>
     <w:p>
@@ -896,120 +206,20 @@
         <w:rPr>
           <w:rFonts w:ascii="Consolas" w:hAnsi="Consolas"/>
         </w:rPr>
-        <w:t xml:space="preserve">python3.13 -m </w:t>
-      </w:r>
-      <w:proofErr w:type="spellStart"/>
-      <w:r>
-        <w:rPr>
-          <w:rFonts w:ascii="Consolas" w:hAnsi="Consolas"/>
-        </w:rPr>
-        <w:t>pip</w:t>
-      </w:r>
-      <w:proofErr w:type="spellEnd"/>
-      <w:r>
-        <w:rPr>
-          <w:rFonts w:ascii="Consolas" w:hAnsi="Consolas"/>
-        </w:rPr>
-        <w:t xml:space="preserve"> </w:t>
-      </w:r>
-      <w:proofErr w:type="spellStart"/>
-      <w:r>
-        <w:rPr>
-          <w:rFonts w:ascii="Consolas" w:hAnsi="Consolas"/>
-        </w:rPr>
-        <w:t>install</w:t>
-      </w:r>
-      <w:proofErr w:type="spellEnd"/>
-      <w:r>
-        <w:rPr>
-          <w:rFonts w:ascii="Consolas" w:hAnsi="Consolas"/>
-        </w:rPr>
-        <w:t xml:space="preserve"> </w:t>
-      </w:r>
-      <w:proofErr w:type="spellStart"/>
-      <w:r>
-        <w:rPr>
-          <w:rFonts w:ascii="Consolas" w:hAnsi="Consolas"/>
-        </w:rPr>
-        <w:t>pythonping</w:t>
-      </w:r>
-      <w:proofErr w:type="spellEnd"/>
-    </w:p>
-    <w:p>
-      <w:pPr>
-        <w:rPr>
-          <w:rFonts w:ascii="Consolas" w:hAnsi="Consolas"/>
-        </w:rPr>
-      </w:pPr>
-      <w:proofErr w:type="spellStart"/>
-      <w:r>
-        <w:rPr>
-          <w:rFonts w:ascii="Consolas" w:hAnsi="Consolas"/>
-        </w:rPr>
-        <w:t>python</w:t>
-      </w:r>
-      <w:proofErr w:type="spellEnd"/>
-      <w:r>
-        <w:rPr>
-          <w:rFonts w:ascii="Consolas" w:hAnsi="Consolas"/>
-        </w:rPr>
-        <w:t>(</w:t>
-      </w:r>
-      <w:proofErr w:type="spellStart"/>
-      <w:r>
-        <w:rPr>
-          <w:rFonts w:ascii="Consolas" w:hAnsi="Consolas"/>
-        </w:rPr>
-        <w:t>ver</w:t>
-      </w:r>
-      <w:proofErr w:type="spellEnd"/>
-      <w:r>
-        <w:rPr>
-          <w:rFonts w:ascii="Consolas" w:hAnsi="Consolas"/>
-        </w:rPr>
-        <w:t xml:space="preserve">) -m </w:t>
-      </w:r>
-      <w:proofErr w:type="spellStart"/>
-      <w:r>
-        <w:rPr>
-          <w:rFonts w:ascii="Consolas" w:hAnsi="Consolas"/>
-        </w:rPr>
-        <w:t>pip</w:t>
-      </w:r>
-      <w:proofErr w:type="spellEnd"/>
-      <w:r>
-        <w:rPr>
-          <w:rFonts w:ascii="Consolas" w:hAnsi="Consolas"/>
-        </w:rPr>
-        <w:t xml:space="preserve"> </w:t>
-      </w:r>
-      <w:proofErr w:type="spellStart"/>
-      <w:r>
-        <w:rPr>
-          <w:rFonts w:ascii="Consolas" w:hAnsi="Consolas"/>
-        </w:rPr>
-        <w:t>install</w:t>
-      </w:r>
-      <w:proofErr w:type="spellEnd"/>
-      <w:r>
-        <w:rPr>
-          <w:rFonts w:ascii="Consolas" w:hAnsi="Consolas"/>
-        </w:rPr>
-        <w:t xml:space="preserve"> (</w:t>
-      </w:r>
-      <w:proofErr w:type="spellStart"/>
-      <w:r>
-        <w:rPr>
-          <w:rFonts w:ascii="Consolas" w:hAnsi="Consolas"/>
-        </w:rPr>
-        <w:t>module</w:t>
-      </w:r>
-      <w:proofErr w:type="spellEnd"/>
-      <w:r>
-        <w:rPr>
-          <w:rFonts w:ascii="Consolas" w:hAnsi="Consolas"/>
-        </w:rPr>
-        <w:t xml:space="preserve">) </w:t>
+        <w:t>python3.13 -m pip install pythonping</w:t>
+      </w:r>
+    </w:p>
+    <w:p>
+      <w:pPr>
+        <w:rPr>
+          <w:rFonts w:ascii="Consolas" w:hAnsi="Consolas"/>
+        </w:rPr>
+      </w:pPr>
+      <w:r>
+        <w:rPr>
+          <w:rFonts w:ascii="Consolas" w:hAnsi="Consolas"/>
+        </w:rPr>
+        <w:t xml:space="preserve">python(ver) -m pip install (module) </w:t>
       </w:r>
     </w:p>
     <w:p>
@@ -1034,21 +244,7 @@
         <w:rPr>
           <w:rFonts w:ascii="Consolas" w:hAnsi="Consolas"/>
         </w:rPr>
-        <w:t xml:space="preserve">Updated network and network plan. </w:t>
-      </w:r>
-      <w:proofErr w:type="spellStart"/>
-      <w:r>
-        <w:rPr>
-          <w:rFonts w:ascii="Consolas" w:hAnsi="Consolas"/>
-        </w:rPr>
-        <w:t>Changes</w:t>
-      </w:r>
-      <w:proofErr w:type="spellEnd"/>
-      <w:r>
-        <w:rPr>
-          <w:rFonts w:ascii="Consolas" w:hAnsi="Consolas"/>
-        </w:rPr>
-        <w:t>:</w:t>
+        <w:t>Updated network and network plan. Changes:</w:t>
       </w:r>
     </w:p>
     <w:p>
@@ -1059,157 +255,122 @@
           <w:rFonts w:ascii="Consolas" w:hAnsi="Consolas"/>
         </w:rPr>
       </w:pPr>
-      <w:proofErr w:type="spellStart"/>
-      <w:r>
-        <w:rPr>
-          <w:rFonts w:ascii="Consolas" w:hAnsi="Consolas"/>
-        </w:rPr>
-        <w:t>Changed</w:t>
-      </w:r>
-      <w:proofErr w:type="spellEnd"/>
-      <w:r>
-        <w:rPr>
-          <w:rFonts w:ascii="Consolas" w:hAnsi="Consolas"/>
-        </w:rPr>
-        <w:t xml:space="preserve"> </w:t>
-      </w:r>
-      <w:proofErr w:type="spellStart"/>
-      <w:r>
-        <w:rPr>
-          <w:rFonts w:ascii="Consolas" w:hAnsi="Consolas"/>
-        </w:rPr>
-        <w:t>the</w:t>
-      </w:r>
-      <w:proofErr w:type="spellEnd"/>
-      <w:r>
-        <w:rPr>
-          <w:rFonts w:ascii="Consolas" w:hAnsi="Consolas"/>
-        </w:rPr>
-        <w:t xml:space="preserve"> private switch </w:t>
-      </w:r>
-      <w:proofErr w:type="spellStart"/>
-      <w:r>
-        <w:rPr>
-          <w:rFonts w:ascii="Consolas" w:hAnsi="Consolas"/>
-        </w:rPr>
-        <w:t>to</w:t>
-      </w:r>
-      <w:proofErr w:type="spellEnd"/>
-      <w:r>
-        <w:rPr>
-          <w:rFonts w:ascii="Consolas" w:hAnsi="Consolas"/>
-        </w:rPr>
-        <w:t xml:space="preserve"> an internal switc</w:t>
-      </w:r>
-      <w:r>
-        <w:rPr>
-          <w:rFonts w:ascii="Consolas" w:hAnsi="Consolas"/>
-        </w:rPr>
-        <w:t xml:space="preserve">h and </w:t>
-      </w:r>
-      <w:proofErr w:type="spellStart"/>
-      <w:r>
-        <w:rPr>
-          <w:rFonts w:ascii="Consolas" w:hAnsi="Consolas"/>
-        </w:rPr>
-        <w:t>configured</w:t>
-      </w:r>
-      <w:proofErr w:type="spellEnd"/>
-      <w:r>
-        <w:rPr>
-          <w:rFonts w:ascii="Consolas" w:hAnsi="Consolas"/>
-        </w:rPr>
-        <w:t xml:space="preserve"> </w:t>
-      </w:r>
-      <w:proofErr w:type="spellStart"/>
-      <w:r>
-        <w:rPr>
-          <w:rFonts w:ascii="Consolas" w:hAnsi="Consolas"/>
-        </w:rPr>
-        <w:t>ThinkHorse</w:t>
-      </w:r>
-      <w:proofErr w:type="spellEnd"/>
-      <w:r>
-        <w:rPr>
-          <w:rFonts w:ascii="Consolas" w:hAnsi="Consolas"/>
-        </w:rPr>
-        <w:t xml:space="preserve"> </w:t>
-      </w:r>
-      <w:proofErr w:type="spellStart"/>
-      <w:r>
-        <w:rPr>
-          <w:rFonts w:ascii="Consolas" w:hAnsi="Consolas"/>
-        </w:rPr>
-        <w:t>to</w:t>
-      </w:r>
-      <w:proofErr w:type="spellEnd"/>
-      <w:r>
-        <w:rPr>
-          <w:rFonts w:ascii="Consolas" w:hAnsi="Consolas"/>
-        </w:rPr>
-        <w:t xml:space="preserve"> </w:t>
-      </w:r>
-      <w:proofErr w:type="spellStart"/>
-      <w:r>
-        <w:rPr>
-          <w:rFonts w:ascii="Consolas" w:hAnsi="Consolas"/>
-        </w:rPr>
-        <w:t>be</w:t>
-      </w:r>
-      <w:proofErr w:type="spellEnd"/>
-      <w:r>
-        <w:rPr>
-          <w:rFonts w:ascii="Consolas" w:hAnsi="Consolas"/>
-        </w:rPr>
-        <w:t xml:space="preserve"> </w:t>
-      </w:r>
-      <w:proofErr w:type="spellStart"/>
-      <w:r>
-        <w:rPr>
-          <w:rFonts w:ascii="Consolas" w:hAnsi="Consolas"/>
-        </w:rPr>
-        <w:t>part</w:t>
-      </w:r>
-      <w:proofErr w:type="spellEnd"/>
-      <w:r>
-        <w:rPr>
-          <w:rFonts w:ascii="Consolas" w:hAnsi="Consolas"/>
-        </w:rPr>
-        <w:t xml:space="preserve"> </w:t>
-      </w:r>
-      <w:proofErr w:type="spellStart"/>
-      <w:r>
-        <w:rPr>
-          <w:rFonts w:ascii="Consolas" w:hAnsi="Consolas"/>
-        </w:rPr>
-        <w:t>of</w:t>
-      </w:r>
-      <w:proofErr w:type="spellEnd"/>
-      <w:r>
-        <w:rPr>
-          <w:rFonts w:ascii="Consolas" w:hAnsi="Consolas"/>
-        </w:rPr>
-        <w:t xml:space="preserve"> network.</w:t>
-      </w:r>
-    </w:p>
-    <w:p>
-      <w:pPr>
-        <w:rPr>
-          <w:rFonts w:ascii="Consolas" w:hAnsi="Consolas"/>
-        </w:rPr>
-      </w:pPr>
-    </w:p>
-    <w:p>
-      <w:pPr>
-        <w:pStyle w:val="Listenabsatz"/>
-        <w:numPr>
-          <w:ilvl w:val="0"/>
-          <w:numId w:val="3"/>
-        </w:numPr>
-        <w:rPr>
-          <w:rFonts w:ascii="Consolas" w:hAnsi="Consolas"/>
-        </w:rPr>
-      </w:pPr>
+      <w:r>
+        <w:rPr>
+          <w:rFonts w:ascii="Consolas" w:hAnsi="Consolas"/>
+        </w:rPr>
+        <w:t>Changed the private switch to an internal switc</w:t>
+      </w:r>
+      <w:r>
+        <w:rPr>
+          <w:rFonts w:ascii="Consolas" w:hAnsi="Consolas"/>
+        </w:rPr>
+        <w:t>h and configured ThinkHorse to be part of network.</w:t>
+      </w:r>
+      <w:r>
+        <w:rPr>
+          <w:rFonts w:ascii="Consolas" w:hAnsi="Consolas"/>
+        </w:rPr>
+        <w:t xml:space="preserve"> (testing purposes)</w:t>
+      </w:r>
+    </w:p>
+    <w:p>
+      <w:pPr>
+        <w:rPr>
+          <w:rFonts w:ascii="Consolas" w:hAnsi="Consolas"/>
+        </w:rPr>
+      </w:pPr>
+    </w:p>
+    <w:p>
+      <w:pPr>
+        <w:rPr>
+          <w:rFonts w:ascii="Consolas" w:hAnsi="Consolas"/>
+        </w:rPr>
+      </w:pPr>
+      <w:r>
+        <w:rPr>
+          <w:rFonts w:ascii="Consolas" w:hAnsi="Consolas"/>
+        </w:rPr>
+        <w:t>11.07</w:t>
+      </w:r>
+      <w:r>
+        <w:rPr>
+          <w:rFonts w:ascii="Consolas" w:hAnsi="Consolas"/>
+        </w:rPr>
+        <w:t>:</w:t>
+      </w:r>
+    </w:p>
+    <w:p>
+      <w:pPr>
+        <w:ind w:left="708"/>
+        <w:rPr>
+          <w:rFonts w:ascii="Consolas" w:hAnsi="Consolas"/>
+        </w:rPr>
+      </w:pPr>
+      <w:r>
+        <w:rPr>
+          <w:rFonts w:ascii="Consolas" w:hAnsi="Consolas"/>
+        </w:rPr>
+        <w:t xml:space="preserve">- Talked to Work colleague about project. He suggested integrating </w:t>
+      </w:r>
+      <w:r>
+        <w:rPr>
+          <w:rFonts w:ascii="Consolas" w:hAnsi="Consolas"/>
+        </w:rPr>
+        <w:t>SNMP and WIM, so i researched what they are and how it would look.</w:t>
+      </w:r>
+    </w:p>
+    <w:p>
+      <w:pPr>
+        <w:ind w:left="708"/>
+        <w:rPr>
+          <w:rFonts w:ascii="Consolas" w:hAnsi="Consolas"/>
+        </w:rPr>
+      </w:pPr>
+      <w:r>
+        <w:rPr>
+          <w:rFonts w:ascii="Consolas" w:hAnsi="Consolas"/>
+        </w:rPr>
+        <w:t>-</w:t>
+      </w:r>
+      <w:r>
+        <w:rPr>
+          <w:rFonts w:ascii="Consolas" w:hAnsi="Consolas"/>
+        </w:rPr>
+        <w:t xml:space="preserve"> Realised including SNMP here adds quite a bit of complexity. Current Plan : manage to ping the addresses from the .csv file via pythonping simply.</w:t>
+      </w:r>
+      <w:r>
+        <w:rPr>
+          <w:rFonts w:ascii="Consolas" w:hAnsi="Consolas"/>
+        </w:rPr>
+        <w:t xml:space="preserve"> Leave SNMP for when i can confidently work with .csv</w:t>
+      </w:r>
+      <w:r>
+        <w:rPr>
+          <w:rFonts w:ascii="Consolas" w:hAnsi="Consolas"/>
+        </w:rPr>
+        <w:t xml:space="preserve"> .</w:t>
+      </w:r>
+    </w:p>
+    <w:p>
+      <w:pPr>
+        <w:ind w:left="708"/>
+        <w:rPr>
+          <w:rFonts w:ascii="Consolas" w:hAnsi="Consolas"/>
+        </w:rPr>
+      </w:pPr>
+      <w:r>
+        <w:rPr>
+          <w:rFonts w:ascii="Consolas" w:hAnsi="Consolas"/>
+        </w:rPr>
+        <w:t>- Worked on Poller.py</w:t>
+      </w:r>
+      <w:r>
+        <w:rPr>
+          <w:rFonts w:ascii="Consolas" w:hAnsi="Consolas"/>
+        </w:rPr>
+        <w:t>, cant refer to specific columns yet.</w:t>
+      </w:r>
     </w:p>
     <w:sectPr>
       <w:pgSz w:w="11906" w:h="16838"/>

</xml_diff>

<commit_message>
Working on functionality with results.db
</commit_message>
<xml_diff>
--- a/documentation/2. Ping poller.docx
+++ b/documentation/2. Ping poller.docx
@@ -853,21 +853,7 @@
         <w:rPr>
           <w:rFonts w:ascii="Consolas" w:hAnsi="Consolas"/>
         </w:rPr>
-        <w:t xml:space="preserve">. </w:t>
-      </w:r>
-      <w:proofErr w:type="gramStart"/>
-      <w:r>
-        <w:rPr>
-          <w:rFonts w:ascii="Consolas" w:hAnsi="Consolas"/>
-        </w:rPr>
-        <w:t>Fix :</w:t>
-      </w:r>
-      <w:proofErr w:type="gramEnd"/>
-      <w:r>
-        <w:rPr>
-          <w:rFonts w:ascii="Consolas" w:hAnsi="Consolas"/>
-        </w:rPr>
-        <w:t xml:space="preserve"> </w:t>
+        <w:t xml:space="preserve">. Fix : </w:t>
       </w:r>
     </w:p>
     <w:p>
@@ -1625,21 +1611,7 @@
         <w:rPr>
           <w:rFonts w:ascii="Consolas" w:hAnsi="Consolas"/>
         </w:rPr>
-        <w:t xml:space="preserve"> </w:t>
-      </w:r>
-      <w:proofErr w:type="gramStart"/>
-      <w:r>
-        <w:rPr>
-          <w:rFonts w:ascii="Consolas" w:hAnsi="Consolas"/>
-        </w:rPr>
-        <w:t>Plan :</w:t>
-      </w:r>
-      <w:proofErr w:type="gramEnd"/>
-      <w:r>
-        <w:rPr>
-          <w:rFonts w:ascii="Consolas" w:hAnsi="Consolas"/>
-        </w:rPr>
-        <w:t xml:space="preserve"> manage </w:t>
+        <w:t xml:space="preserve"> Plan : manage </w:t>
       </w:r>
       <w:proofErr w:type="spellStart"/>
       <w:r>
@@ -1872,7 +1844,6 @@
         <w:t xml:space="preserve"> .</w:t>
       </w:r>
       <w:proofErr w:type="spellStart"/>
-      <w:proofErr w:type="gramStart"/>
       <w:r>
         <w:rPr>
           <w:rFonts w:ascii="Consolas" w:hAnsi="Consolas"/>
@@ -1886,7 +1857,6 @@
         </w:rPr>
         <w:t xml:space="preserve"> .</w:t>
       </w:r>
-      <w:proofErr w:type="gramEnd"/>
     </w:p>
     <w:p>
       <w:pPr>
@@ -2031,98 +2001,84 @@
         <w:rPr>
           <w:rFonts w:ascii="Consolas" w:hAnsi="Consolas"/>
         </w:rPr>
-        <w:t>Issue</w:t>
-      </w:r>
-      <w:proofErr w:type="spellEnd"/>
-      <w:r>
-        <w:rPr>
-          <w:rFonts w:ascii="Consolas" w:hAnsi="Consolas"/>
-        </w:rPr>
-        <w:t xml:space="preserve"> was </w:t>
-      </w:r>
-      <w:proofErr w:type="spellStart"/>
-      <w:r>
-        <w:rPr>
-          <w:rFonts w:ascii="Consolas" w:hAnsi="Consolas"/>
-        </w:rPr>
-        <w:t>very</w:t>
-      </w:r>
-      <w:proofErr w:type="spellEnd"/>
-      <w:r>
-        <w:rPr>
-          <w:rFonts w:ascii="Consolas" w:hAnsi="Consolas"/>
-        </w:rPr>
-        <w:t xml:space="preserve"> </w:t>
-      </w:r>
-      <w:proofErr w:type="gramStart"/>
-      <w:r>
-        <w:rPr>
-          <w:rFonts w:ascii="Consolas" w:hAnsi="Consolas"/>
-        </w:rPr>
-        <w:t>simple</w:t>
-      </w:r>
-      <w:proofErr w:type="gramEnd"/>
-      <w:r>
-        <w:rPr>
-          <w:rFonts w:ascii="Consolas" w:hAnsi="Consolas"/>
-        </w:rPr>
-        <w:t xml:space="preserve">. </w:t>
-      </w:r>
-      <w:proofErr w:type="spellStart"/>
-      <w:r>
-        <w:rPr>
-          <w:rFonts w:ascii="Consolas" w:hAnsi="Consolas"/>
-        </w:rPr>
-        <w:t>Finished</w:t>
-      </w:r>
-      <w:proofErr w:type="spellEnd"/>
-      <w:r>
-        <w:rPr>
-          <w:rFonts w:ascii="Consolas" w:hAnsi="Consolas"/>
-        </w:rPr>
-        <w:t xml:space="preserve"> Task </w:t>
-      </w:r>
-      <w:proofErr w:type="spellStart"/>
-      <w:r>
-        <w:rPr>
-          <w:rFonts w:ascii="Consolas" w:hAnsi="Consolas"/>
-        </w:rPr>
-        <w:t>within</w:t>
-      </w:r>
-      <w:proofErr w:type="spellEnd"/>
-      <w:r>
-        <w:rPr>
-          <w:rFonts w:ascii="Consolas" w:hAnsi="Consolas"/>
-        </w:rPr>
-        <w:t xml:space="preserve"> 7 </w:t>
-      </w:r>
-      <w:proofErr w:type="spellStart"/>
-      <w:r>
-        <w:rPr>
-          <w:rFonts w:ascii="Consolas" w:hAnsi="Consolas"/>
-        </w:rPr>
-        <w:t>lines</w:t>
-      </w:r>
-      <w:proofErr w:type="spellEnd"/>
-      <w:r>
-        <w:rPr>
-          <w:rFonts w:ascii="Consolas" w:hAnsi="Consolas"/>
-        </w:rPr>
-        <w:t xml:space="preserve"> </w:t>
-      </w:r>
-      <w:proofErr w:type="spellStart"/>
-      <w:r>
-        <w:rPr>
-          <w:rFonts w:ascii="Consolas" w:hAnsi="Consolas"/>
-        </w:rPr>
-        <w:t>of</w:t>
-      </w:r>
-      <w:proofErr w:type="spellEnd"/>
-      <w:r>
-        <w:rPr>
-          <w:rFonts w:ascii="Consolas" w:hAnsi="Consolas"/>
-        </w:rPr>
-        <w:t xml:space="preserve"> code.</w:t>
+        <w:t>Got</w:t>
+      </w:r>
+      <w:proofErr w:type="spellEnd"/>
+      <w:r>
+        <w:rPr>
+          <w:rFonts w:ascii="Consolas" w:hAnsi="Consolas"/>
+        </w:rPr>
+        <w:t xml:space="preserve"> </w:t>
+      </w:r>
+      <w:proofErr w:type="spellStart"/>
+      <w:r>
+        <w:rPr>
+          <w:rFonts w:ascii="Consolas" w:hAnsi="Consolas"/>
+        </w:rPr>
+        <w:t>pinging</w:t>
+      </w:r>
+      <w:proofErr w:type="spellEnd"/>
+      <w:r>
+        <w:rPr>
+          <w:rFonts w:ascii="Consolas" w:hAnsi="Consolas"/>
+        </w:rPr>
+        <w:t xml:space="preserve"> </w:t>
+      </w:r>
+      <w:proofErr w:type="spellStart"/>
+      <w:r>
+        <w:rPr>
+          <w:rFonts w:ascii="Consolas" w:hAnsi="Consolas"/>
+        </w:rPr>
+        <w:t>to</w:t>
+      </w:r>
+      <w:proofErr w:type="spellEnd"/>
+      <w:r>
+        <w:rPr>
+          <w:rFonts w:ascii="Consolas" w:hAnsi="Consolas"/>
+        </w:rPr>
+        <w:t xml:space="preserve"> </w:t>
+      </w:r>
+      <w:proofErr w:type="spellStart"/>
+      <w:r>
+        <w:rPr>
+          <w:rFonts w:ascii="Consolas" w:hAnsi="Consolas"/>
+        </w:rPr>
+        <w:t>work</w:t>
+      </w:r>
+      <w:proofErr w:type="spellEnd"/>
+      <w:r>
+        <w:rPr>
+          <w:rFonts w:ascii="Consolas" w:hAnsi="Consolas"/>
+        </w:rPr>
+        <w:t>.</w:t>
+      </w:r>
+    </w:p>
+    <w:p>
+      <w:pPr>
+        <w:rPr>
+          <w:rFonts w:ascii="Consolas" w:hAnsi="Consolas"/>
+        </w:rPr>
+      </w:pPr>
+      <w:r>
+        <w:rPr>
+          <w:rFonts w:ascii="Consolas" w:hAnsi="Consolas"/>
+        </w:rPr>
+        <w:lastRenderedPageBreak/>
+        <w:t>14.07:</w:t>
+      </w:r>
+    </w:p>
+    <w:p>
+      <w:pPr>
+        <w:rPr>
+          <w:rFonts w:ascii="Consolas" w:hAnsi="Consolas"/>
+        </w:rPr>
+      </w:pPr>
+      <w:r>
+        <w:rPr>
+          <w:rFonts w:ascii="Consolas" w:hAnsi="Consolas"/>
+        </w:rPr>
+        <w:tab/>
+        <w:t xml:space="preserve">- </w:t>
       </w:r>
     </w:p>
     <w:sectPr>

</xml_diff>